<commit_message>
removed NL relocation preferences.
No move to NL in the foreseeable future.
</commit_message>
<xml_diff>
--- a/Motivatie.docx
+++ b/Motivatie.docx
@@ -3,138 +3,14 @@
 <w:document xmlns:wpc="http://schemas.microsoft.com/office/word/2010/wordprocessingCanvas" xmlns:cx="http://schemas.microsoft.com/office/drawing/2014/chartex" xmlns:cx1="http://schemas.microsoft.com/office/drawing/2015/9/8/chartex" xmlns:cx2="http://schemas.microsoft.com/office/drawing/2015/10/21/chartex" xmlns:cx3="http://schemas.microsoft.com/office/drawing/2016/5/9/chartex" xmlns:cx4="http://schemas.microsoft.com/office/drawing/2016/5/10/chartex" xmlns:cx5="http://schemas.microsoft.com/office/drawing/2016/5/11/chartex" xmlns:cx6="http://schemas.microsoft.com/office/drawing/2016/5/12/chartex" xmlns:cx7="http://schemas.microsoft.com/office/drawing/2016/5/13/chartex" xmlns:cx8="http://schemas.microsoft.com/office/drawing/2016/5/14/chartex" xmlns:mc="http://schemas.openxmlformats.org/markup-compatibility/2006" xmlns:aink="http://schemas.microsoft.com/office/drawing/2016/ink" xmlns:am3d="http://schemas.microsoft.com/office/drawing/2017/model3d" xmlns:o="urn:schemas-microsoft-com:office:office" xmlns:oel="http://schemas.microsoft.com/office/2019/extlst" xmlns:r="http://schemas.openxmlformats.org/officeDocument/2006/relationships" xmlns:m="http://schemas.openxmlformats.org/officeDocument/2006/math" xmlns:v="urn:schemas-microsoft-com:vml" xmlns:wp14="http://schemas.microsoft.com/office/word/2010/wordprocessingDrawing" xmlns:wp="http://schemas.openxmlformats.org/drawingml/2006/wordprocessingDrawing" xmlns:w10="urn:schemas-microsoft-com:office:word" xmlns:w="http://schemas.openxmlformats.org/wordprocessingml/2006/main" xmlns:w14="http://schemas.microsoft.com/office/word/2010/wordml" xmlns:w15="http://schemas.microsoft.com/office/word/2012/wordml" xmlns:w16cex="http://schemas.microsoft.com/office/word/2018/wordml/cex" xmlns:w16cid="http://schemas.microsoft.com/office/word/2016/wordml/cid" xmlns:w16="http://schemas.microsoft.com/office/word/2018/wordml" xmlns:w16du="http://schemas.microsoft.com/office/word/2023/wordml/word16du" xmlns:w16sdtdh="http://schemas.microsoft.com/office/word/2020/wordml/sdtdatahash" xmlns:w16sdtfl="http://schemas.microsoft.com/office/word/2024/wordml/sdtformatlock" xmlns:w16se="http://schemas.microsoft.com/office/word/2015/wordml/symex" xmlns:wpg="http://schemas.microsoft.com/office/word/2010/wordprocessingGroup" xmlns:wpi="http://schemas.microsoft.com/office/word/2010/wordprocessingInk" xmlns:wne="http://schemas.microsoft.com/office/word/2006/wordml" xmlns:wps="http://schemas.microsoft.com/office/word/2010/wordprocessingShape" mc:Ignorable="w14 w15 w16se w16cid w16 w16cex w16sdtdh w16sdtfl w16du wp14">
   <w:body>
     <w:p>
+      <w:pPr>
+        <w:pStyle w:val="Title"/>
+      </w:pPr>
       <w:r>
         <w:t>IA</w:t>
       </w:r>
       <w:r>
         <w:t xml:space="preserve">DA snippets </w:t>
-      </w:r>
-    </w:p>
-    <w:p>
-      <w:pPr>
-        <w:pStyle w:val="Heading1"/>
-        <w:rPr>
-          <w:lang w:val="nl-NL"/>
-        </w:rPr>
-      </w:pPr>
-      <w:r>
-        <w:rPr>
-          <w:lang w:val="nl-NL"/>
-        </w:rPr>
-        <w:t xml:space="preserve">Attention </w:t>
-      </w:r>
-      <w:r>
-        <w:rPr>
-          <w:lang w:val="nl-NL"/>
-        </w:rPr>
-        <w:br/>
-      </w:r>
-    </w:p>
-    <w:p>
-      <w:pPr>
-        <w:pStyle w:val="Heading2"/>
-        <w:rPr>
-          <w:lang w:val="nl-NL"/>
-        </w:rPr>
-      </w:pPr>
-      <w:r>
-        <w:rPr>
-          <w:lang w:val="nl-NL"/>
-        </w:rPr>
-        <w:t>Versie 1: Via vacaturetekst</w:t>
-      </w:r>
-    </w:p>
-    <w:p>
-      <w:pPr>
-        <w:rPr>
-          <w:lang w:val="nl-NL"/>
-        </w:rPr>
-      </w:pPr>
-      <w:r>
-        <w:rPr>
-          <w:lang w:val="nl-NL"/>
-        </w:rPr>
-        <w:t>Toen ik uw vacature voor [functienaam] las, viel mij direct op hoe sterk de rol aansluit bij mijn ervaring en ambities. De combinatie van technische diepgang, teamverantwoordelijkheid en strategisch denken sprak me onmiddellijk aan.</w:t>
-      </w:r>
-    </w:p>
-    <w:p>
-      <w:r>
-        <w:pict w14:anchorId="3AB29F20">
-          <v:rect id="_x0000_i1081" style="width:0;height:1.5pt" o:hralign="center" o:hrstd="t" o:hr="t" fillcolor="#a0a0a0" stroked="f"/>
-        </w:pict>
-      </w:r>
-    </w:p>
-    <w:p>
-      <w:pPr>
-        <w:pStyle w:val="Heading2"/>
-        <w:rPr>
-          <w:lang w:val="nl-NL"/>
-        </w:rPr>
-      </w:pPr>
-      <w:r>
-        <w:rPr>
-          <w:lang w:val="nl-NL"/>
-        </w:rPr>
-        <w:t>Versie 2: Via netwerk</w:t>
-      </w:r>
-    </w:p>
-    <w:p>
-      <w:pPr>
-        <w:rPr>
-          <w:lang w:val="nl-NL"/>
-        </w:rPr>
-      </w:pPr>
-      <w:r>
-        <w:rPr>
-          <w:lang w:val="nl-NL"/>
-        </w:rPr>
-        <w:t>Via een oud-collega hoorde ik over de openstaande positie binnen uw organisatie. Zijn enthousiasme over de werksfeer en de technische uitdagingen wekte direct mijn nieuwsgierigheid, en na het lezen van de vacature wist ik: dit past bij mij.</w:t>
-      </w:r>
-    </w:p>
-    <w:p>
-      <w:r>
-        <w:pict w14:anchorId="16063103">
-          <v:rect id="_x0000_i1084" style="width:0;height:1.5pt" o:hralign="center" o:hrstd="t" o:hr="t" fillcolor="#a0a0a0" stroked="f"/>
-        </w:pict>
-      </w:r>
-    </w:p>
-    <w:p>
-      <w:pPr>
-        <w:pStyle w:val="Heading2"/>
-        <w:rPr>
-          <w:lang w:val="nl-NL"/>
-        </w:rPr>
-      </w:pPr>
-      <w:r>
-        <w:rPr>
-          <w:lang w:val="nl-NL"/>
-        </w:rPr>
-        <w:t xml:space="preserve">Versie </w:t>
-      </w:r>
-      <w:r>
-        <w:rPr>
-          <w:lang w:val="nl-NL"/>
-        </w:rPr>
-        <w:t>3</w:t>
-      </w:r>
-      <w:r>
-        <w:rPr>
-          <w:lang w:val="nl-NL"/>
-        </w:rPr>
-        <w:t>: Via persoonlijke oriëntatie op Nederland</w:t>
-      </w:r>
-    </w:p>
-    <w:p>
-      <w:pPr>
-        <w:rPr>
-          <w:lang w:val="nl-NL"/>
-        </w:rPr>
-      </w:pPr>
-      <w:r>
-        <w:rPr>
-          <w:lang w:val="nl-NL"/>
-        </w:rPr>
-        <w:t>In mijn zoektocht naar een technische leidersrol in Nederland, waarin ik zowel mijn internationale ervaring als mijn liefde voor goed gestructureerde softwareontwikkeling kwijt kan, kwam ik uw vacature tegen. Wat me aansprak was het evenwicht tussen technische complexiteit en menselijke samenwerking.</w:t>
       </w:r>
     </w:p>
     <w:p>
@@ -205,7 +81,6 @@
         <w:rPr>
           <w:lang w:val="nl-NL"/>
         </w:rPr>
-        <w:lastRenderedPageBreak/>
         <w:t>Versie 2: Focus op leiderschap en coaching</w:t>
       </w:r>
     </w:p>
@@ -292,6 +167,7 @@
     </w:p>
     <w:p>
       <w:r>
+        <w:lastRenderedPageBreak/>
         <w:pict w14:anchorId="0E3B0748">
           <v:rect id="_x0000_i1052" style="width:0;height:1.5pt" o:hralign="center" o:hrstd="t" o:hr="t" fillcolor="#a0a0a0" stroked="f"/>
         </w:pict>
@@ -322,6 +198,133 @@
           <w:lang w:val="nl-NL"/>
         </w:rPr>
         <w:t>Mijn interesse in deze rol komt voort uit mijn wens om bij te dragen aan een organisatie met maatschappelijke relevantie. Ik ben op zoek naar een omgeving waar technologie niet alleen efficiëntie brengt, maar ook echte impact heeft op mensen en processen. Deze functie biedt precies die kans, en sluit perfect aan bij mijn waarden en ervaring.</w:t>
+      </w:r>
+    </w:p>
+    <w:p>
+      <w:pPr>
+        <w:pStyle w:val="Heading1"/>
+        <w:rPr>
+          <w:lang w:val="nl-NL"/>
+        </w:rPr>
+      </w:pPr>
+      <w:r>
+        <w:rPr>
+          <w:lang w:val="nl-NL"/>
+        </w:rPr>
+        <w:t xml:space="preserve">Attention </w:t>
+      </w:r>
+      <w:r>
+        <w:rPr>
+          <w:lang w:val="nl-NL"/>
+        </w:rPr>
+        <w:br/>
+      </w:r>
+    </w:p>
+    <w:p>
+      <w:pPr>
+        <w:pStyle w:val="Heading2"/>
+        <w:rPr>
+          <w:lang w:val="nl-NL"/>
+        </w:rPr>
+      </w:pPr>
+      <w:r>
+        <w:rPr>
+          <w:lang w:val="nl-NL"/>
+        </w:rPr>
+        <w:t>Versie 1: Via vacaturetekst</w:t>
+      </w:r>
+    </w:p>
+    <w:p>
+      <w:pPr>
+        <w:rPr>
+          <w:lang w:val="nl-NL"/>
+        </w:rPr>
+      </w:pPr>
+      <w:r>
+        <w:rPr>
+          <w:lang w:val="nl-NL"/>
+        </w:rPr>
+        <w:t>Toen ik uw vacature voor [functienaam] las, viel mij direct op hoe sterk de rol aansluit bij mijn ervaring en ambities. De combinatie van technische diepgang, teamverantwoordelijkheid en strategisch denken sprak me onmiddellijk aan.</w:t>
+      </w:r>
+    </w:p>
+    <w:p>
+      <w:r>
+        <w:pict w14:anchorId="283770A9">
+          <v:rect id="_x0000_i1141" style="width:0;height:1.5pt" o:hralign="center" o:hrstd="t" o:hr="t" fillcolor="#a0a0a0" stroked="f"/>
+        </w:pict>
+      </w:r>
+    </w:p>
+    <w:p>
+      <w:pPr>
+        <w:pStyle w:val="Heading2"/>
+        <w:rPr>
+          <w:lang w:val="nl-NL"/>
+        </w:rPr>
+      </w:pPr>
+      <w:r>
+        <w:rPr>
+          <w:lang w:val="nl-NL"/>
+        </w:rPr>
+        <w:t>Versie 2: Via netwerk</w:t>
+      </w:r>
+    </w:p>
+    <w:p>
+      <w:pPr>
+        <w:rPr>
+          <w:lang w:val="nl-NL"/>
+        </w:rPr>
+      </w:pPr>
+      <w:r>
+        <w:rPr>
+          <w:lang w:val="nl-NL"/>
+        </w:rPr>
+        <w:t>Via een oud-collega hoorde ik over de openstaande positie binnen uw organisatie. Zijn enthousiasme over de werksfeer en de technische uitdagingen wekte direct mijn nieuwsgierigheid, en na het lezen van de vacature wist ik: dit past bij mij.</w:t>
+      </w:r>
+    </w:p>
+    <w:p>
+      <w:r>
+        <w:pict w14:anchorId="71E9BD9C">
+          <v:rect id="_x0000_i1142" style="width:0;height:1.5pt" o:hralign="center" o:hrstd="t" o:hr="t" fillcolor="#a0a0a0" stroked="f"/>
+        </w:pict>
+      </w:r>
+    </w:p>
+    <w:p>
+      <w:pPr>
+        <w:pStyle w:val="Heading2"/>
+        <w:rPr>
+          <w:lang w:val="nl-NL"/>
+        </w:rPr>
+      </w:pPr>
+      <w:r>
+        <w:rPr>
+          <w:lang w:val="nl-NL"/>
+        </w:rPr>
+        <w:t xml:space="preserve">Versie </w:t>
+      </w:r>
+      <w:r>
+        <w:rPr>
+          <w:lang w:val="nl-NL"/>
+        </w:rPr>
+        <w:t>3</w:t>
+      </w:r>
+      <w:r>
+        <w:rPr>
+          <w:lang w:val="nl-NL"/>
+        </w:rPr>
+        <w:t>: Via persoonlijke oriëntatie op Nederland</w:t>
+      </w:r>
+    </w:p>
+    <w:p>
+      <w:pPr>
+        <w:rPr>
+          <w:lang w:val="nl-NL"/>
+        </w:rPr>
+      </w:pPr>
+      <w:r>
+        <w:rPr>
+          <w:lang w:val="nl-NL"/>
+        </w:rPr>
+        <w:t>In mijn zoektocht naar een technische leidersrol in Nederland, waarin ik zowel mijn internationale ervaring als mijn liefde voor goed gestructureerde softwareontwikkeling kwijt kan, kwam ik uw vacature tegen. Wat me aansprak was het evenwicht tussen technische complexiteit en menselijke samenwerking.</w:t>
       </w:r>
     </w:p>
     <w:p>

</xml_diff>